<commit_message>
Roehampton: Related as partner on the whole estate, Grange at a £7m placeholder value
Co-Authored-By: Claude Fable 5.1 <noreply@anthropic.com>
Claude-Session: https://claude.ai/code/session_01PFPSEueuEDo5NrLkRsAgfj
</commit_message>
<xml_diff>
--- a/client/public/share/roehampton-sports-ground-estate-k7x2/docs/Roehampton - Offer letter to Knight Frank for Related - draft.docx
+++ b/client/public/share/roehampton-sports-ground-estate-k7x2/docs/Roehampton - Offer letter to Knight Frank for Related - draft.docx
@@ -131,7 +131,7 @@
           <w:sz w:val="21"/>
           <w:szCs w:val="21"/>
         </w:rPr>
-        <w:t xml:space="preserve">We are instructed by Related to submit the following offer for the freehold interest in the Roehampton Sports Ground Estate as a whole, Lots 1 to 4 as described in your September 2026 brochure, extending to about 38 acres.</w:t>
+        <w:t xml:space="preserve">We are instructed by Related, with whom this firm is acting in partnership on the acquisition, to submit the following offer for the freehold interest in the Roehampton Sports Ground Estate as a whole, Lots 1 to 4 as described in your September 2026 brochure, extending to about 38 acres.</w:t>
       </w:r>
     </w:p>
     <w:p>
@@ -228,7 +228,7 @@
                 <w:sz w:val="21"/>
                 <w:szCs w:val="21"/>
               </w:rPr>
-              <w:t xml:space="preserve">Related [entity to be confirmed], or a nominee special purpose vehicle under Related's control.</w:t>
+              <w:t xml:space="preserve">A joint venture of Related and Bruce Gillingham Pollard's client interests [entity to be confirmed], or a nominee special purpose vehicle.</w:t>
             </w:r>
           </w:p>
         </w:tc>
@@ -569,7 +569,7 @@
           <w:sz w:val="21"/>
           <w:szCs w:val="21"/>
         </w:rPr>
-        <w:t xml:space="preserve">The Grange is to be converted to residential under Class MA. We understand the Bank is submitting the prior approval application; exchange is conditional on prior approval having been granted, or the purchaser being satisfied with the application and its timetable.</w:t>
+        <w:t xml:space="preserve">The Grange is to be converted to residential under Class MA by the partnership, with Related leading the residential underwrite. We understand the Bank is submitting the prior approval application; exchange is conditional on prior approval having been granted, or the purchaser being satisfied with the application and its timetable.</w:t>
       </w:r>
     </w:p>
     <w:p>
@@ -638,7 +638,7 @@
           <w:sz w:val="21"/>
           <w:szCs w:val="21"/>
         </w:rPr>
-        <w:t xml:space="preserve">Related will fund the acquisition from equity and senior debt from its existing relationship lenders; proof of funds will be provided on request. Related is [one or two sentences on Related's London residential and mixed-use record, to be inserted].</w:t>
+        <w:t xml:space="preserve">The purchaser will fund the acquisition from partnership equity and senior debt from Related's existing relationship lenders; proof of funds will be provided on request. Related is [one or two sentences on Related's London residential and mixed-use record, to be inserted].</w:t>
       </w:r>
     </w:p>
     <w:p>

</xml_diff>

<commit_message>
Roehampton: same-day completion of purchase, Third Space lease and Club regrant; no landlord's works; Excel model fixed
</commit_message>
<xml_diff>
--- a/client/public/share/roehampton-sports-ground-estate-k7x2/docs/Roehampton - Offer letter to Knight Frank for Related - draft.docx
+++ b/client/public/share/roehampton-sports-ground-estate-k7x2/docs/Roehampton - Offer letter to Knight Frank for Related - draft.docx
@@ -531,7 +531,7 @@
           <w:sz w:val="21"/>
           <w:szCs w:val="21"/>
         </w:rPr>
-        <w:t xml:space="preserve">The offer assumes the All England Club will surrender its 2021 lease and take a new 10-year lease of the playing fields at £100,000 a year, on the terms we are putting to the Club in parallel, with the leisure buildings and car parks returned to the landlord on completion. Exchange is conditional on that surrender and regrant being agreed in a form satisfactory to the purchaser. We would welcome the Bank's and your help in opening that conversation with the Club.</w:t>
+        <w:t xml:space="preserve">The offer assumes the All England Club will surrender its 2021 lease and take a new 10-year lease of the playing fields at £100,000 a year, on the terms we are putting to the Club in parallel, with the surrender and regrant completing on the same day as the purchase. Exchange is conditional on that surrender and regrant being agreed in a form satisfactory to the purchaser. We would welcome the Bank's and your help in opening that conversation with the Club.</w:t>
       </w:r>
     </w:p>
     <w:p>
@@ -550,7 +550,7 @@
           <w:sz w:val="21"/>
           <w:szCs w:val="21"/>
         </w:rPr>
-        <w:t xml:space="preserve">The purchaser intends to let the Sports Club and Pavilion to a health club operator on a 20-year lease, and has agreed heads of terms in principle; exchange is conditional on an agreement for lease being exchanged simultaneously or on terms the purchaser is satisfied with.</w:t>
+        <w:t xml:space="preserve">The purchaser intends to let the Sports Club and Pavilion to a health club operator on a 20-year lease completing on the day of purchase, and has agreed heads of terms in principle; exchange is conditional on an agreement for lease being exchanged simultaneously or on terms the purchaser is satisfied with.</w:t>
       </w:r>
     </w:p>
     <w:p>
@@ -569,7 +569,7 @@
           <w:sz w:val="21"/>
           <w:szCs w:val="21"/>
         </w:rPr>
-        <w:t xml:space="preserve">The Grange is to be converted to residential under Class MA by the partnership, with Related leading the residential underwrite. We understand the Bank is submitting the prior approval application; exchange is conditional on prior approval having been granted, or the purchaser being satisfied with the application and its timetable.</w:t>
+        <w:t xml:space="preserve">The Grange and the cottages are to be redeveloped as residential by the partnership, The Grange under Class MA, with Related leading the residential underwrite; the whole estate is to be held and sold as one lot. We understand the Bank is submitting the prior approval application; exchange is conditional on prior approval having been granted, or the purchaser being satisfied with the application and its timetable.</w:t>
       </w:r>
     </w:p>
     <w:p>

</xml_diff>